<commit_message>
Lots of changes to TTS, rules, counters
Signed-off-by: euroledger <geominat@gmail.com>
</commit_message>
<xml_diff>
--- a/New Rules/NORMANDY PLAYBOOK.docx
+++ b/New Rules/NORMANDY PLAYBOOK.docx
@@ -969,21 +969,7 @@
             <w:rStyle w:val="Hyperlink"/>
             <w:color w:val="000000" w:themeColor="text1"/>
           </w:rPr>
-          <w:t>beac</w:t>
-        </w:r>
-        <w:r>
-          <w:rPr>
-            <w:rStyle w:val="Hyperlink"/>
-            <w:color w:val="000000" w:themeColor="text1"/>
-          </w:rPr>
-          <w:t>h</w:t>
-        </w:r>
-        <w:r>
-          <w:rPr>
-            <w:rStyle w:val="Hyperlink"/>
-            <w:color w:val="000000" w:themeColor="text1"/>
-          </w:rPr>
-          <w:t>heads</w:t>
+          <w:t>beachheads</w:t>
         </w:r>
       </w:hyperlink>
       <w:r>
@@ -1107,35 +1093,7 @@
           <w:bCs/>
           <w:iCs/>
         </w:rPr>
-        <w:t>The 21st Panzer Division’s counter</w:t>
-      </w:r>
-      <w:r>
-        <w:rPr>
-          <w:bCs/>
-          <w:iCs/>
-        </w:rPr>
-        <w:t>-</w:t>
-      </w:r>
-      <w:r>
-        <w:rPr>
-          <w:bCs/>
-          <w:iCs/>
-        </w:rPr>
-        <w:t>attack on June 6–7</w:t>
-      </w:r>
-      <w:r>
-        <w:rPr>
-          <w:bCs/>
-          <w:iCs/>
-        </w:rPr>
-        <w:t xml:space="preserve"> </w:t>
-      </w:r>
-      <w:r>
-        <w:rPr>
-          <w:bCs/>
-          <w:iCs/>
-        </w:rPr>
-        <w:t xml:space="preserve">1944, was the most significant German armored response to the D-Day landings, aimed at stopping the British advance and preventing them from capturing the critical city of Caen. </w:t>
+        <w:t xml:space="preserve">The 21st Panzer Division’s counter-attack on June 6–7 1944, was the most significant German armored response to the D-Day landings, aimed at stopping the British advance and preventing them from capturing the critical city of Caen. </w:t>
       </w:r>
     </w:p>
     <w:p>
@@ -1544,10 +1502,7 @@
     </w:p>
     <w:p>
       <w:r>
-        <w:t xml:space="preserve">The campaign in the Cotentin Peninsula (6-30 June 1944) was the first major Allied advance </w:t>
-      </w:r>
-      <w:r>
-        <w:t xml:space="preserve">after the </w:t>
+        <w:t xml:space="preserve">The campaign in the Cotentin Peninsula (6-30 June 1944) was the first major Allied advance after the </w:t>
       </w:r>
       <w:hyperlink r:id="rId28" w:history="1">
         <w:r>
@@ -1555,13 +1510,7 @@
         </w:r>
       </w:hyperlink>
       <w:r>
-        <w:t>,</w:t>
-      </w:r>
-      <w:r>
-        <w:t xml:space="preserve"> and ended with </w:t>
-      </w:r>
-      <w:r>
-        <w:t xml:space="preserve">the </w:t>
+        <w:t xml:space="preserve">, and ended with the </w:t>
       </w:r>
       <w:hyperlink r:id="rId29" w:history="1">
         <w:r>
@@ -1617,6 +1566,51 @@
       </w:r>
     </w:p>
     <w:p>
+      <w:r>
+        <w:t xml:space="preserve">The battle of Villers-Bocage was the result of a British attempt to improve their position by exploiting a temporary vulnerability in the German defences to the west of the city of </w:t>
+      </w:r>
+      <w:hyperlink r:id="rId30" w:history="1">
+        <w:r>
+          <w:t>Cae</w:t>
+        </w:r>
+      </w:hyperlink>
+      <w:r>
+        <w:t>n</w:t>
+      </w:r>
+      <w:r>
+        <w:t>.</w:t>
+      </w:r>
+    </w:p>
+    <w:p>
+      <w:r>
+        <w:t>The town was briefly captured but t</w:t>
+      </w:r>
+      <w:r>
+        <w:t>he inexperienced XXX Corps commander, Gerard Buckner, made several errors</w:t>
+      </w:r>
+      <w:r>
+        <w:t xml:space="preserve"> thereafter</w:t>
+      </w:r>
+      <w:r>
+        <w:t>, not least the mishandling of 7</w:t>
+      </w:r>
+      <w:r>
+        <w:rPr>
+          <w:vertAlign w:val="superscript"/>
+        </w:rPr>
+        <w:t>th</w:t>
+      </w:r>
+      <w:r>
+        <w:t xml:space="preserve"> Armored Divison, resulting in the loss of Villers-Bocage, which was not captured </w:t>
+      </w:r>
+      <w:r>
+        <w:t xml:space="preserve">again </w:t>
+      </w:r>
+      <w:r>
+        <w:t>until August.</w:t>
+      </w:r>
+    </w:p>
+    <w:p>
       <w:pPr>
         <w:rPr>
           <w:sz w:val="10"/>
@@ -1624,40 +1618,29 @@
         </w:rPr>
       </w:pPr>
       <w:r>
-        <w:t xml:space="preserve">The battle of Villers-Bocage was the result of a British attempt to improve their position by exploiting a temporary vulnerability in the German defences to the west of the city of </w:t>
-      </w:r>
-      <w:hyperlink r:id="rId30" w:history="1">
-        <w:r>
-          <w:t>Cae</w:t>
+        <w:br/>
+      </w:r>
+    </w:p>
+    <w:p>
+      <w:r>
+        <w:t>T</w:t>
+      </w:r>
+      <w:r>
+        <w:t xml:space="preserve">he British withdrawal marked the end of the post D-Day "scramble for ground" and the start of a </w:t>
+      </w:r>
+      <w:r>
+        <w:t xml:space="preserve">grinding </w:t>
+      </w:r>
+      <w:hyperlink r:id="rId31" w:tooltip="Attrition warfare" w:history="1">
+        <w:r>
+          <w:t>attritional battle</w:t>
         </w:r>
       </w:hyperlink>
       <w:r>
-        <w:t>n</w:t>
+        <w:t xml:space="preserve"> for Caen</w:t>
       </w:r>
       <w:r>
         <w:t>.</w:t>
-      </w:r>
-      <w:r>
-        <w:br/>
-      </w:r>
-    </w:p>
-    <w:p>
-      <w:r>
-        <w:t>T</w:t>
-      </w:r>
-      <w:r>
-        <w:t xml:space="preserve">he British withdrawal marked the end of the post D-Day "scramble for ground" and the start of a </w:t>
-      </w:r>
-      <w:r>
-        <w:t xml:space="preserve">grinding </w:t>
-      </w:r>
-      <w:hyperlink r:id="rId31" w:tooltip="Attrition warfare" w:history="1">
-        <w:r>
-          <w:t>attritional battle</w:t>
-        </w:r>
-      </w:hyperlink>
-      <w:r>
-        <w:t xml:space="preserve"> for Caen</w:t>
       </w:r>
     </w:p>
     <w:p/>
@@ -1775,7 +1758,6 @@
           <w:sz w:val="32"/>
           <w:szCs w:val="32"/>
         </w:rPr>
-        <w:lastRenderedPageBreak/>
         <w:t xml:space="preserve">CARD 10 </w:t>
       </w:r>
       <w:r>
@@ -2053,10 +2035,7 @@
         <w:t xml:space="preserve">Bagration </w:t>
       </w:r>
       <w:r>
-        <w:t xml:space="preserve">was </w:t>
-      </w:r>
-      <w:r>
-        <w:t xml:space="preserve">the </w:t>
+        <w:t xml:space="preserve">was the </w:t>
       </w:r>
       <w:hyperlink r:id="rId47" w:tooltip="Codename" w:history="1">
         <w:r>
@@ -2072,24 +2051,21 @@
         </w:r>
       </w:hyperlink>
       <w:r>
-        <w:t xml:space="preserve"> 1944</w:t>
-      </w:r>
-      <w:r>
+        <w:t xml:space="preserve"> 1944 </w:t>
+      </w:r>
+      <w:r>
+        <w:rPr>
+          <w:bCs/>
+        </w:rPr>
+        <w:t>Belorussian Strategic Offensive Operation</w:t>
+      </w:r>
+      <w:r>
+        <w:rPr>
+          <w:vertAlign w:val="superscript"/>
+        </w:rPr>
         <w:t xml:space="preserve"> </w:t>
       </w:r>
       <w:r>
-        <w:rPr>
-          <w:bCs/>
-        </w:rPr>
-        <w:t>Belorussian Strategic Offensive Operation</w:t>
-      </w:r>
-      <w:r>
-        <w:rPr>
-          <w:vertAlign w:val="superscript"/>
-        </w:rPr>
-        <w:t xml:space="preserve"> </w:t>
-      </w:r>
-      <w:r>
         <w:t xml:space="preserve">during </w:t>
       </w:r>
       <w:hyperlink r:id="rId49" w:history="1">
@@ -2114,13 +2090,7 @@
         </w:r>
       </w:hyperlink>
       <w:r>
-        <w:t xml:space="preserve"> and</w:t>
-      </w:r>
-      <w:r>
-        <w:t xml:space="preserve"> </w:t>
-      </w:r>
-      <w:r>
-        <w:t xml:space="preserve">eastern </w:t>
+        <w:t xml:space="preserve"> and eastern </w:t>
       </w:r>
       <w:hyperlink r:id="rId52" w:history="1">
         <w:r>
@@ -2128,10 +2098,7 @@
         </w:r>
       </w:hyperlink>
       <w:r>
-        <w:t xml:space="preserve"> between</w:t>
-      </w:r>
-      <w:r>
-        <w:t xml:space="preserve"> 22 June and 19 August 1944. </w:t>
+        <w:t xml:space="preserve"> between 22 June and 19 August 1944. </w:t>
       </w:r>
     </w:p>
     <w:p>
@@ -2209,6 +2176,7 @@
         <w:rPr>
           <w:bCs/>
         </w:rPr>
+        <w:lastRenderedPageBreak/>
         <w:t>Operation Epsom</w:t>
       </w:r>
       <w:r>
@@ -2264,7 +2232,6 @@
         </w:rPr>
       </w:pPr>
       <w:r>
-        <w:lastRenderedPageBreak/>
         <w:t>Preceded by attacks to s</w:t>
       </w:r>
       <w:r>
@@ -4698,6 +4665,7 @@
   <w:style w:type="character" w:default="1" w:styleId="DefaultParagraphFont">
     <w:name w:val="Default Paragraph Font"/>
     <w:uiPriority w:val="1"/>
+    <w:semiHidden/>
     <w:unhideWhenUsed/>
   </w:style>
   <w:style w:type="table" w:default="1" w:styleId="TableNormal">

</xml_diff>

<commit_message>
Cards, Map, Rules changes
Signed-off-by: euroledger <geominat@gmail.com>
</commit_message>
<xml_diff>
--- a/New Rules/NORMANDY PLAYBOOK.docx
+++ b/New Rules/NORMANDY PLAYBOOK.docx
@@ -289,7 +289,7 @@
       <w:bookmarkStart w:id="3" w:name="_Toc225957489"/>
       <w:bookmarkStart w:id="4" w:name="_Toc225957528"/>
       <w:bookmarkStart w:id="5" w:name="_Toc225957556"/>
-      <w:bookmarkStart w:id="6" w:name="_Toc226280021"/>
+      <w:bookmarkStart w:id="6" w:name="_Toc227252121"/>
       <w:r>
         <w:lastRenderedPageBreak/>
         <w:t>TABLE OF CONTENTS</w:t>
@@ -343,7 +343,7 @@
               <w:kern w:val="2"/>
               <w:sz w:val="24"/>
               <w:szCs w:val="24"/>
-              <w:lang w:eastAsia="en-GB"/>
+              <w:lang w:val="en-US"/>
               <w14:ligatures w14:val="standardContextual"/>
             </w:rPr>
           </w:pPr>
@@ -356,7 +356,7 @@
           <w:r>
             <w:fldChar w:fldCharType="separate"/>
           </w:r>
-          <w:hyperlink w:anchor="_Toc226280021" w:history="1">
+          <w:hyperlink w:anchor="_Toc227252121" w:history="1">
             <w:r>
               <w:rPr>
                 <w:rStyle w:val="Hyperlink"/>
@@ -383,7 +383,7 @@
                 <w:noProof/>
                 <w:webHidden/>
               </w:rPr>
-              <w:instrText xml:space="preserve"> PAGEREF _Toc226280021 \h </w:instrText>
+              <w:instrText xml:space="preserve"> PAGEREF _Toc227252121 \h </w:instrText>
             </w:r>
             <w:r>
               <w:rPr>
@@ -415,6 +415,319 @@
           </w:hyperlink>
         </w:p>
         <w:p>
+          <w:pPr>
+            <w:pStyle w:val="TOC1"/>
+            <w:tabs>
+              <w:tab w:val="right" w:leader="dot" w:pos="10456"/>
+            </w:tabs>
+            <w:rPr>
+              <w:rFonts w:asciiTheme="minorHAnsi" w:eastAsiaTheme="minorEastAsia" w:hAnsiTheme="minorHAnsi" w:cstheme="minorBidi"/>
+              <w:noProof/>
+              <w:color w:val="auto"/>
+              <w:kern w:val="2"/>
+              <w:sz w:val="24"/>
+              <w:szCs w:val="24"/>
+              <w:lang w:val="en-US"/>
+              <w14:ligatures w14:val="standardContextual"/>
+            </w:rPr>
+          </w:pPr>
+          <w:hyperlink w:anchor="_Toc227252122" w:history="1">
+            <w:r>
+              <w:rPr>
+                <w:rStyle w:val="Hyperlink"/>
+                <w:noProof/>
+              </w:rPr>
+              <w:t>Event Card Historical Background</w:t>
+            </w:r>
+            <w:r>
+              <w:rPr>
+                <w:noProof/>
+                <w:webHidden/>
+              </w:rPr>
+              <w:tab/>
+            </w:r>
+            <w:r>
+              <w:rPr>
+                <w:noProof/>
+                <w:webHidden/>
+              </w:rPr>
+              <w:fldChar w:fldCharType="begin"/>
+            </w:r>
+            <w:r>
+              <w:rPr>
+                <w:noProof/>
+                <w:webHidden/>
+              </w:rPr>
+              <w:instrText xml:space="preserve"> PAGEREF _Toc227252122 \h </w:instrText>
+            </w:r>
+            <w:r>
+              <w:rPr>
+                <w:noProof/>
+                <w:webHidden/>
+              </w:rPr>
+            </w:r>
+            <w:r>
+              <w:rPr>
+                <w:noProof/>
+                <w:webHidden/>
+              </w:rPr>
+              <w:fldChar w:fldCharType="separate"/>
+            </w:r>
+            <w:r>
+              <w:rPr>
+                <w:noProof/>
+                <w:webHidden/>
+              </w:rPr>
+              <w:t>3</w:t>
+            </w:r>
+            <w:r>
+              <w:rPr>
+                <w:noProof/>
+                <w:webHidden/>
+              </w:rPr>
+              <w:fldChar w:fldCharType="end"/>
+            </w:r>
+          </w:hyperlink>
+        </w:p>
+        <w:p>
+          <w:pPr>
+            <w:pStyle w:val="TOC2"/>
+            <w:tabs>
+              <w:tab w:val="right" w:leader="dot" w:pos="10456"/>
+            </w:tabs>
+            <w:rPr>
+              <w:rFonts w:asciiTheme="minorHAnsi" w:eastAsiaTheme="minorEastAsia" w:hAnsiTheme="minorHAnsi" w:cstheme="minorBidi"/>
+              <w:noProof/>
+              <w:color w:val="auto"/>
+              <w:kern w:val="2"/>
+              <w:sz w:val="24"/>
+              <w:szCs w:val="24"/>
+              <w:lang w:val="en-US"/>
+              <w14:ligatures w14:val="standardContextual"/>
+            </w:rPr>
+          </w:pPr>
+          <w:hyperlink w:anchor="_Toc227252123" w:history="1">
+            <w:r>
+              <w:rPr>
+                <w:rStyle w:val="Hyperlink"/>
+                <w:b/>
+                <w:bCs/>
+                <w:noProof/>
+              </w:rPr>
+              <w:t xml:space="preserve">CARD 1 </w:t>
+            </w:r>
+            <w:r>
+              <w:rPr>
+                <w:rStyle w:val="Hyperlink"/>
+                <w:b/>
+                <w:bCs/>
+                <w:i/>
+                <w:iCs/>
+                <w:noProof/>
+              </w:rPr>
+              <w:t>D-Day Landings First Wave</w:t>
+            </w:r>
+            <w:r>
+              <w:rPr>
+                <w:noProof/>
+                <w:webHidden/>
+              </w:rPr>
+              <w:tab/>
+            </w:r>
+            <w:r>
+              <w:rPr>
+                <w:noProof/>
+                <w:webHidden/>
+              </w:rPr>
+              <w:fldChar w:fldCharType="begin"/>
+            </w:r>
+            <w:r>
+              <w:rPr>
+                <w:noProof/>
+                <w:webHidden/>
+              </w:rPr>
+              <w:instrText xml:space="preserve"> PAGEREF _Toc227252123 \h </w:instrText>
+            </w:r>
+            <w:r>
+              <w:rPr>
+                <w:noProof/>
+                <w:webHidden/>
+              </w:rPr>
+            </w:r>
+            <w:r>
+              <w:rPr>
+                <w:noProof/>
+                <w:webHidden/>
+              </w:rPr>
+              <w:fldChar w:fldCharType="separate"/>
+            </w:r>
+            <w:r>
+              <w:rPr>
+                <w:noProof/>
+                <w:webHidden/>
+              </w:rPr>
+              <w:t>3</w:t>
+            </w:r>
+            <w:r>
+              <w:rPr>
+                <w:noProof/>
+                <w:webHidden/>
+              </w:rPr>
+              <w:fldChar w:fldCharType="end"/>
+            </w:r>
+          </w:hyperlink>
+        </w:p>
+        <w:p>
+          <w:pPr>
+            <w:pStyle w:val="TOC1"/>
+            <w:tabs>
+              <w:tab w:val="right" w:leader="dot" w:pos="10456"/>
+            </w:tabs>
+            <w:rPr>
+              <w:rFonts w:asciiTheme="minorHAnsi" w:eastAsiaTheme="minorEastAsia" w:hAnsiTheme="minorHAnsi" w:cstheme="minorBidi"/>
+              <w:noProof/>
+              <w:color w:val="auto"/>
+              <w:kern w:val="2"/>
+              <w:sz w:val="24"/>
+              <w:szCs w:val="24"/>
+              <w:lang w:val="en-US"/>
+              <w14:ligatures w14:val="standardContextual"/>
+            </w:rPr>
+          </w:pPr>
+          <w:hyperlink w:anchor="_Toc227252124" w:history="1">
+            <w:r>
+              <w:rPr>
+                <w:rStyle w:val="Hyperlink"/>
+                <w:noProof/>
+              </w:rPr>
+              <w:t>Extended Example of Play</w:t>
+            </w:r>
+            <w:r>
+              <w:rPr>
+                <w:noProof/>
+                <w:webHidden/>
+              </w:rPr>
+              <w:tab/>
+            </w:r>
+            <w:r>
+              <w:rPr>
+                <w:noProof/>
+                <w:webHidden/>
+              </w:rPr>
+              <w:fldChar w:fldCharType="begin"/>
+            </w:r>
+            <w:r>
+              <w:rPr>
+                <w:noProof/>
+                <w:webHidden/>
+              </w:rPr>
+              <w:instrText xml:space="preserve"> PAGEREF _Toc227252124 \h </w:instrText>
+            </w:r>
+            <w:r>
+              <w:rPr>
+                <w:noProof/>
+                <w:webHidden/>
+              </w:rPr>
+            </w:r>
+            <w:r>
+              <w:rPr>
+                <w:noProof/>
+                <w:webHidden/>
+              </w:rPr>
+              <w:fldChar w:fldCharType="separate"/>
+            </w:r>
+            <w:r>
+              <w:rPr>
+                <w:noProof/>
+                <w:webHidden/>
+              </w:rPr>
+              <w:t>7</w:t>
+            </w:r>
+            <w:r>
+              <w:rPr>
+                <w:noProof/>
+                <w:webHidden/>
+              </w:rPr>
+              <w:fldChar w:fldCharType="end"/>
+            </w:r>
+          </w:hyperlink>
+        </w:p>
+        <w:p>
+          <w:pPr>
+            <w:pStyle w:val="TOC1"/>
+            <w:tabs>
+              <w:tab w:val="right" w:leader="dot" w:pos="10456"/>
+            </w:tabs>
+            <w:rPr>
+              <w:rFonts w:asciiTheme="minorHAnsi" w:eastAsiaTheme="minorEastAsia" w:hAnsiTheme="minorHAnsi" w:cstheme="minorBidi"/>
+              <w:noProof/>
+              <w:color w:val="auto"/>
+              <w:kern w:val="2"/>
+              <w:sz w:val="24"/>
+              <w:szCs w:val="24"/>
+              <w:lang w:val="en-US"/>
+              <w14:ligatures w14:val="standardContextual"/>
+            </w:rPr>
+          </w:pPr>
+          <w:hyperlink w:anchor="_Toc227252125" w:history="1">
+            <w:r>
+              <w:rPr>
+                <w:rStyle w:val="Hyperlink"/>
+                <w:noProof/>
+              </w:rPr>
+              <w:t>Designer Notes</w:t>
+            </w:r>
+            <w:r>
+              <w:rPr>
+                <w:noProof/>
+                <w:webHidden/>
+              </w:rPr>
+              <w:tab/>
+            </w:r>
+            <w:r>
+              <w:rPr>
+                <w:noProof/>
+                <w:webHidden/>
+              </w:rPr>
+              <w:fldChar w:fldCharType="begin"/>
+            </w:r>
+            <w:r>
+              <w:rPr>
+                <w:noProof/>
+                <w:webHidden/>
+              </w:rPr>
+              <w:instrText xml:space="preserve"> PAGEREF _Toc227252125 \h </w:instrText>
+            </w:r>
+            <w:r>
+              <w:rPr>
+                <w:noProof/>
+                <w:webHidden/>
+              </w:rPr>
+            </w:r>
+            <w:r>
+              <w:rPr>
+                <w:noProof/>
+                <w:webHidden/>
+              </w:rPr>
+              <w:fldChar w:fldCharType="separate"/>
+            </w:r>
+            <w:r>
+              <w:rPr>
+                <w:noProof/>
+                <w:webHidden/>
+              </w:rPr>
+              <w:t>8</w:t>
+            </w:r>
+            <w:r>
+              <w:rPr>
+                <w:noProof/>
+                <w:webHidden/>
+              </w:rPr>
+              <w:fldChar w:fldCharType="end"/>
+            </w:r>
+          </w:hyperlink>
+        </w:p>
+        <w:p>
           <w:r>
             <w:rPr>
               <w:b/>
@@ -694,6 +1007,7 @@
           <w:color w:val="4F6228" w:themeColor="accent3" w:themeShade="80"/>
         </w:rPr>
       </w:pPr>
+      <w:bookmarkStart w:id="7" w:name="_Toc227252122"/>
       <w:r>
         <w:rPr>
           <w:rStyle w:val="IntenseEmphasis"/>
@@ -701,6 +1015,7 @@
         </w:rPr>
         <w:t>Event Card Historical Background</w:t>
       </w:r>
+      <w:bookmarkEnd w:id="7"/>
     </w:p>
     <w:p/>
     <w:p>
@@ -738,6 +1053,7 @@
           <w:bCs/>
         </w:rPr>
       </w:pPr>
+      <w:bookmarkStart w:id="8" w:name="_Toc227252123"/>
       <w:r>
         <w:rPr>
           <w:rFonts w:ascii="Berkeley Book" w:hAnsi="Berkeley Book"/>
@@ -764,6 +1080,7 @@
         </w:rPr>
         <w:t>D-Day Landings First Wave</w:t>
       </w:r>
+      <w:bookmarkEnd w:id="8"/>
     </w:p>
     <w:p>
       <w:pPr>
@@ -1147,7 +1464,6 @@
           <w:sz w:val="32"/>
           <w:szCs w:val="32"/>
         </w:rPr>
-        <w:lastRenderedPageBreak/>
         <w:t xml:space="preserve">CARD 5 </w:t>
       </w:r>
       <w:r>
@@ -1583,16 +1899,7 @@
     </w:p>
     <w:p>
       <w:r>
-        <w:t>The town was briefly captured but t</w:t>
-      </w:r>
-      <w:r>
-        <w:t>he inexperienced XXX Corps commander, Gerard Buckner, made several errors</w:t>
-      </w:r>
-      <w:r>
-        <w:t xml:space="preserve"> thereafter</w:t>
-      </w:r>
-      <w:r>
-        <w:t>, not least the mishandling of 7</w:t>
+        <w:t>The town was briefly captured but the inexperienced XXX Corps commander, Gerard Buckner, made several errors thereafter, not least the mishandling of 7</w:t>
       </w:r>
       <w:r>
         <w:rPr>
@@ -1601,13 +1908,7 @@
         <w:t>th</w:t>
       </w:r>
       <w:r>
-        <w:t xml:space="preserve"> Armored Divison, resulting in the loss of Villers-Bocage, which was not captured </w:t>
-      </w:r>
-      <w:r>
-        <w:t xml:space="preserve">again </w:t>
-      </w:r>
-      <w:r>
-        <w:t>until August.</w:t>
+        <w:t xml:space="preserve"> Armored Divison, resulting in the loss of Villers-Bocage, which was not captured again until August.</w:t>
       </w:r>
     </w:p>
     <w:p>
@@ -1673,6 +1974,7 @@
         <w:rPr>
           <w:bCs/>
         </w:rPr>
+        <w:lastRenderedPageBreak/>
         <w:t>Michael Wittmann</w:t>
       </w:r>
       <w:r>
@@ -2140,6 +2442,7 @@
     </w:p>
     <w:p>
       <w:r>
+        <w:lastRenderedPageBreak/>
         <w:t>The great storm succeeded in doing what the Germans had not been able to do, destroy the great "mulberry" artificial harbors</w:t>
       </w:r>
       <w:r>
@@ -2176,7 +2479,6 @@
         <w:rPr>
           <w:bCs/>
         </w:rPr>
-        <w:lastRenderedPageBreak/>
         <w:t>Operation Epsom</w:t>
       </w:r>
       <w:r>
@@ -2224,13 +2526,6 @@
       </w:r>
     </w:p>
     <w:p>
-      <w:pPr>
-        <w:rPr>
-          <w:iCs/>
-          <w:sz w:val="32"/>
-          <w:szCs w:val="32"/>
-        </w:rPr>
-      </w:pPr>
       <w:r>
         <w:t>Preceded by attacks to s</w:t>
       </w:r>
@@ -2271,6 +2566,637 @@
           <w:szCs w:val="32"/>
         </w:rPr>
       </w:pPr>
+      <w:r>
+        <w:rPr>
+          <w:sz w:val="32"/>
+          <w:szCs w:val="32"/>
+        </w:rPr>
+        <w:t>CARD 15</w:t>
+      </w:r>
+      <w:r>
+        <w:rPr>
+          <w:i/>
+          <w:iCs/>
+          <w:sz w:val="32"/>
+          <w:szCs w:val="32"/>
+        </w:rPr>
+        <w:t xml:space="preserve"> Operation Windsor</w:t>
+      </w:r>
+    </w:p>
+    <w:p>
+      <w:pPr>
+        <w:pStyle w:val="NormalWeb"/>
+        <w:rPr>
+          <w:rFonts w:ascii="Berkeley Book" w:hAnsi="Berkeley Book"/>
+          <w:b w:val="0"/>
+          <w:bCs w:val="0"/>
+          <w:i w:val="0"/>
+          <w:iCs w:val="0"/>
+          <w:color w:val="000000" w:themeColor="text1"/>
+          <w:sz w:val="22"/>
+          <w:szCs w:val="22"/>
+        </w:rPr>
+      </w:pPr>
+      <w:r>
+        <w:rPr>
+          <w:rFonts w:ascii="Berkeley Book" w:hAnsi="Berkeley Book"/>
+          <w:b w:val="0"/>
+          <w:bCs w:val="0"/>
+          <w:i w:val="0"/>
+          <w:iCs w:val="0"/>
+          <w:color w:val="000000" w:themeColor="text1"/>
+          <w:sz w:val="22"/>
+          <w:szCs w:val="22"/>
+        </w:rPr>
+        <w:t>Operation Windsor was a Canadian offensive launched between 4–5 July 1944</w:t>
+      </w:r>
+      <w:r>
+        <w:rPr>
+          <w:rFonts w:ascii="Berkeley Book" w:hAnsi="Berkeley Book"/>
+          <w:b w:val="0"/>
+          <w:bCs w:val="0"/>
+          <w:i w:val="0"/>
+          <w:iCs w:val="0"/>
+          <w:color w:val="000000" w:themeColor="text1"/>
+          <w:sz w:val="22"/>
+          <w:szCs w:val="22"/>
+        </w:rPr>
+        <w:t>.</w:t>
+      </w:r>
+      <w:r>
+        <w:rPr>
+          <w:rFonts w:ascii="Berkeley Book" w:hAnsi="Berkeley Book"/>
+          <w:b w:val="0"/>
+          <w:bCs w:val="0"/>
+          <w:i w:val="0"/>
+          <w:iCs w:val="0"/>
+          <w:color w:val="000000" w:themeColor="text1"/>
+          <w:sz w:val="22"/>
+          <w:szCs w:val="22"/>
+        </w:rPr>
+        <w:t xml:space="preserve"> </w:t>
+      </w:r>
+    </w:p>
+    <w:p>
+      <w:pPr>
+        <w:pStyle w:val="NormalWeb"/>
+        <w:rPr>
+          <w:rFonts w:ascii="Berkeley Book" w:hAnsi="Berkeley Book"/>
+          <w:b w:val="0"/>
+          <w:bCs w:val="0"/>
+          <w:i w:val="0"/>
+          <w:iCs w:val="0"/>
+          <w:color w:val="000000" w:themeColor="text1"/>
+          <w:sz w:val="22"/>
+          <w:szCs w:val="22"/>
+        </w:rPr>
+      </w:pPr>
+      <w:r>
+        <w:rPr>
+          <w:rFonts w:ascii="Berkeley Book" w:hAnsi="Berkeley Book"/>
+          <w:b w:val="0"/>
+          <w:bCs w:val="0"/>
+          <w:i w:val="0"/>
+          <w:iCs w:val="0"/>
+          <w:color w:val="000000" w:themeColor="text1"/>
+          <w:sz w:val="22"/>
+          <w:szCs w:val="22"/>
+        </w:rPr>
+        <w:t>T</w:t>
+      </w:r>
+      <w:r>
+        <w:rPr>
+          <w:rFonts w:ascii="Berkeley Book" w:hAnsi="Berkeley Book"/>
+          <w:b w:val="0"/>
+          <w:bCs w:val="0"/>
+          <w:i w:val="0"/>
+          <w:iCs w:val="0"/>
+          <w:color w:val="000000" w:themeColor="text1"/>
+          <w:sz w:val="22"/>
+          <w:szCs w:val="22"/>
+        </w:rPr>
+        <w:t xml:space="preserve">he attack was undertaken by the </w:t>
+      </w:r>
+      <w:hyperlink r:id="rId60" w:history="1">
+        <w:r>
+          <w:rPr>
+            <w:rStyle w:val="Hyperlink"/>
+            <w:rFonts w:ascii="Berkeley Book" w:hAnsi="Berkeley Book"/>
+            <w:b w:val="0"/>
+            <w:bCs w:val="0"/>
+            <w:i w:val="0"/>
+            <w:iCs w:val="0"/>
+            <w:color w:val="000000" w:themeColor="text1"/>
+            <w:sz w:val="22"/>
+            <w:szCs w:val="22"/>
+            <w:u w:val="none"/>
+          </w:rPr>
+          <w:t>3rd Canadian Infantry Division</w:t>
+        </w:r>
+      </w:hyperlink>
+      <w:r>
+        <w:rPr>
+          <w:rFonts w:ascii="Berkeley Book" w:hAnsi="Berkeley Book"/>
+          <w:b w:val="0"/>
+          <w:bCs w:val="0"/>
+          <w:i w:val="0"/>
+          <w:iCs w:val="0"/>
+          <w:color w:val="000000" w:themeColor="text1"/>
+          <w:sz w:val="22"/>
+          <w:szCs w:val="22"/>
+        </w:rPr>
+        <w:t xml:space="preserve"> in an attempt to capture the Norman town of </w:t>
+      </w:r>
+      <w:hyperlink r:id="rId61" w:history="1">
+        <w:r>
+          <w:rPr>
+            <w:rStyle w:val="Hyperlink"/>
+            <w:rFonts w:ascii="Berkeley Book" w:hAnsi="Berkeley Book"/>
+            <w:b w:val="0"/>
+            <w:bCs w:val="0"/>
+            <w:i w:val="0"/>
+            <w:iCs w:val="0"/>
+            <w:color w:val="000000" w:themeColor="text1"/>
+            <w:sz w:val="22"/>
+            <w:szCs w:val="22"/>
+            <w:u w:val="none"/>
+          </w:rPr>
+          <w:t>Carpiquet</w:t>
+        </w:r>
+      </w:hyperlink>
+      <w:r>
+        <w:rPr>
+          <w:rFonts w:ascii="Berkeley Book" w:hAnsi="Berkeley Book"/>
+          <w:b w:val="0"/>
+          <w:bCs w:val="0"/>
+          <w:i w:val="0"/>
+          <w:iCs w:val="0"/>
+          <w:color w:val="000000" w:themeColor="text1"/>
+          <w:sz w:val="22"/>
+          <w:szCs w:val="22"/>
+        </w:rPr>
+        <w:t xml:space="preserve"> and the adjacent airfield from German forces. </w:t>
+      </w:r>
+    </w:p>
+    <w:p>
+      <w:pPr>
+        <w:pStyle w:val="NormalWeb"/>
+        <w:rPr>
+          <w:rFonts w:ascii="Berkeley Book" w:hAnsi="Berkeley Book"/>
+          <w:b w:val="0"/>
+          <w:bCs w:val="0"/>
+          <w:i w:val="0"/>
+          <w:iCs w:val="0"/>
+          <w:color w:val="000000" w:themeColor="text1"/>
+          <w:sz w:val="22"/>
+          <w:szCs w:val="22"/>
+        </w:rPr>
+      </w:pPr>
+      <w:r>
+        <w:rPr>
+          <w:rFonts w:ascii="Berkeley Book" w:hAnsi="Berkeley Book"/>
+          <w:b w:val="0"/>
+          <w:bCs w:val="0"/>
+          <w:i w:val="0"/>
+          <w:iCs w:val="0"/>
+          <w:color w:val="000000" w:themeColor="text1"/>
+          <w:sz w:val="22"/>
+          <w:szCs w:val="22"/>
+        </w:rPr>
+        <w:t xml:space="preserve">The attack was originally intended to take place during the later stages of </w:t>
+      </w:r>
+      <w:hyperlink r:id="rId62" w:history="1">
+        <w:r>
+          <w:rPr>
+            <w:rStyle w:val="Hyperlink"/>
+            <w:rFonts w:ascii="Berkeley Book" w:hAnsi="Berkeley Book"/>
+            <w:b w:val="0"/>
+            <w:bCs w:val="0"/>
+            <w:i w:val="0"/>
+            <w:iCs w:val="0"/>
+            <w:color w:val="000000" w:themeColor="text1"/>
+            <w:sz w:val="22"/>
+            <w:szCs w:val="22"/>
+            <w:u w:val="none"/>
+          </w:rPr>
+          <w:t>Operation Epsom</w:t>
+        </w:r>
+      </w:hyperlink>
+      <w:r>
+        <w:rPr>
+          <w:rFonts w:ascii="Berkeley Book" w:hAnsi="Berkeley Book"/>
+          <w:b w:val="0"/>
+          <w:bCs w:val="0"/>
+          <w:i w:val="0"/>
+          <w:iCs w:val="0"/>
+          <w:color w:val="000000" w:themeColor="text1"/>
+          <w:sz w:val="22"/>
+          <w:szCs w:val="22"/>
+        </w:rPr>
+        <w:t>, as a means of protecting the eastern flank of the main assault. It was postponed and launched the following week.</w:t>
+      </w:r>
+    </w:p>
+    <w:p>
+      <w:pPr>
+        <w:pStyle w:val="NormalWeb"/>
+        <w:rPr>
+          <w:rFonts w:ascii="Berkeley Book" w:hAnsi="Berkeley Book"/>
+          <w:b w:val="0"/>
+          <w:bCs w:val="0"/>
+          <w:color w:val="000000" w:themeColor="text1"/>
+          <w:sz w:val="32"/>
+          <w:szCs w:val="32"/>
+        </w:rPr>
+      </w:pPr>
+      <w:r>
+        <w:rPr>
+          <w:rFonts w:ascii="Berkeley Book" w:hAnsi="Berkeley Book"/>
+          <w:b w:val="0"/>
+          <w:bCs w:val="0"/>
+          <w:i w:val="0"/>
+          <w:iCs w:val="0"/>
+          <w:color w:val="000000" w:themeColor="text1"/>
+          <w:sz w:val="32"/>
+          <w:szCs w:val="32"/>
+        </w:rPr>
+        <w:t>CARD 16</w:t>
+      </w:r>
+      <w:r>
+        <w:rPr>
+          <w:rFonts w:ascii="Berkeley Book" w:hAnsi="Berkeley Book"/>
+          <w:b w:val="0"/>
+          <w:bCs w:val="0"/>
+          <w:color w:val="000000" w:themeColor="text1"/>
+          <w:sz w:val="32"/>
+          <w:szCs w:val="32"/>
+        </w:rPr>
+        <w:t xml:space="preserve"> Battle of the Bocage</w:t>
+      </w:r>
+    </w:p>
+    <w:p>
+      <w:pPr>
+        <w:pStyle w:val="NormalWeb"/>
+        <w:rPr>
+          <w:rFonts w:ascii="Berkeley Book" w:hAnsi="Berkeley Book"/>
+          <w:b w:val="0"/>
+          <w:bCs w:val="0"/>
+          <w:i w:val="0"/>
+          <w:iCs w:val="0"/>
+          <w:sz w:val="22"/>
+          <w:szCs w:val="22"/>
+        </w:rPr>
+      </w:pPr>
+      <w:r>
+        <w:rPr>
+          <w:rFonts w:ascii="Berkeley Book" w:hAnsi="Berkeley Book"/>
+          <w:b w:val="0"/>
+          <w:bCs w:val="0"/>
+          <w:i w:val="0"/>
+          <w:iCs w:val="0"/>
+          <w:sz w:val="22"/>
+          <w:szCs w:val="22"/>
+        </w:rPr>
+        <w:t>The Normandy bocage—a landscape of ancient, thick hedgerows on top of high earthen embankments—presented severe, unforeseen tactical problems for Allied forces following the June 1944 D-Day landings. This terrain transformed the Norman countryside into a maze-like battlefield that favored German defenders and stalled the Allied advance for weeks</w:t>
+      </w:r>
+    </w:p>
+    <w:p>
+      <w:pPr>
+        <w:rPr>
+          <w:rFonts w:eastAsia="Times New Roman" w:cs="Times New Roman"/>
+          <w:color w:val="auto"/>
+          <w:lang w:eastAsia="en-GB"/>
+        </w:rPr>
+      </w:pPr>
+      <w:r>
+        <w:rPr>
+          <w:rFonts w:eastAsia="Times New Roman" w:cs="Times New Roman"/>
+          <w:color w:val="auto"/>
+          <w:lang w:eastAsia="en-GB"/>
+        </w:rPr>
+        <w:t>Tanks, particularly Shermans, could not easily cross the banks. Attempting to climb them exposed their vulnerable, thin underbellies to anti-tank fire. Single, disabled tanks often blocked the narrow sunken lanes, stalling armored columns.</w:t>
+      </w:r>
+    </w:p>
+    <w:p>
+      <w:r>
+        <w:t>These challenges necessitated the invention of the "Rhino" tanks, featuring steel cutters welded to the front to break through the hedges, and forced the development of new close-quarters tactics to overcome the defensive deadlock.</w:t>
+      </w:r>
+    </w:p>
+    <w:p>
+      <w:pPr>
+        <w:rPr>
+          <w:i/>
+          <w:iCs/>
+          <w:sz w:val="32"/>
+          <w:szCs w:val="32"/>
+        </w:rPr>
+      </w:pPr>
+      <w:r>
+        <w:rPr>
+          <w:sz w:val="32"/>
+          <w:szCs w:val="32"/>
+        </w:rPr>
+        <w:t xml:space="preserve">CARD 17 </w:t>
+      </w:r>
+      <w:r>
+        <w:rPr>
+          <w:i/>
+          <w:iCs/>
+          <w:sz w:val="32"/>
+          <w:szCs w:val="32"/>
+        </w:rPr>
+        <w:t>Nebelwerfers</w:t>
+      </w:r>
+    </w:p>
+    <w:p>
+      <w:pPr>
+        <w:rPr>
+          <w:color w:val="auto"/>
+        </w:rPr>
+      </w:pPr>
+      <w:r>
+        <w:rPr>
+          <w:color w:val="auto"/>
+        </w:rPr>
+        <w:t xml:space="preserve">The Nebelwerfer ("Smoke Mortar") was a German multiple rocket launcher system that played a significant role as tactical artillery during the 1944 Normandy Campaign. </w:t>
+      </w:r>
+    </w:p>
+    <w:p>
+      <w:pPr>
+        <w:rPr>
+          <w:color w:val="auto"/>
+        </w:rPr>
+      </w:pPr>
+      <w:r>
+        <w:rPr>
+          <w:color w:val="auto"/>
+        </w:rPr>
+        <w:t>Known by Allied troops as "Screaming Mimis" or "Moaning Minnies" due to the distinctive, terrifying sound of incoming rockets, these weapons were used in large numbers to disrupt Allied troop concentrations. </w:t>
+      </w:r>
+    </w:p>
+    <w:p>
+      <w:pPr>
+        <w:rPr>
+          <w:i/>
+          <w:iCs/>
+          <w:color w:val="auto"/>
+          <w:sz w:val="32"/>
+          <w:szCs w:val="32"/>
+        </w:rPr>
+      </w:pPr>
+      <w:r>
+        <w:rPr>
+          <w:color w:val="auto"/>
+          <w:sz w:val="32"/>
+          <w:szCs w:val="32"/>
+        </w:rPr>
+        <w:t xml:space="preserve">CARD 18 </w:t>
+      </w:r>
+      <w:r>
+        <w:rPr>
+          <w:i/>
+          <w:iCs/>
+          <w:color w:val="auto"/>
+          <w:sz w:val="32"/>
+          <w:szCs w:val="32"/>
+        </w:rPr>
+        <w:t>Operation Charnwood</w:t>
+      </w:r>
+    </w:p>
+    <w:p>
+      <w:pPr>
+        <w:rPr>
+          <w:color w:val="auto"/>
+        </w:rPr>
+      </w:pPr>
+      <w:r>
+        <w:rPr>
+          <w:bCs/>
+          <w:color w:val="auto"/>
+        </w:rPr>
+        <w:t>Operation Charnwood</w:t>
+      </w:r>
+      <w:r>
+        <w:rPr>
+          <w:color w:val="auto"/>
+        </w:rPr>
+        <w:t xml:space="preserve"> was an </w:t>
+      </w:r>
+      <w:hyperlink r:id="rId63" w:tooltip="United Kindom" w:history="1">
+        <w:r>
+          <w:rPr>
+            <w:rStyle w:val="Hyperlink"/>
+            <w:color w:val="auto"/>
+            <w:u w:val="none"/>
+          </w:rPr>
+          <w:t>Anglo</w:t>
+        </w:r>
+      </w:hyperlink>
+      <w:r>
+        <w:rPr>
+          <w:color w:val="auto"/>
+        </w:rPr>
+        <w:t>-</w:t>
+      </w:r>
+      <w:hyperlink r:id="rId64" w:tooltip="Canada" w:history="1">
+        <w:r>
+          <w:rPr>
+            <w:rStyle w:val="Hyperlink"/>
+            <w:color w:val="auto"/>
+            <w:u w:val="none"/>
+          </w:rPr>
+          <w:t>Canadian</w:t>
+        </w:r>
+      </w:hyperlink>
+      <w:r>
+        <w:rPr>
+          <w:color w:val="auto"/>
+        </w:rPr>
+        <w:t xml:space="preserve"> offensive that took place from 8–9 July 1944</w:t>
+      </w:r>
+      <w:r>
+        <w:rPr>
+          <w:color w:val="auto"/>
+        </w:rPr>
+        <w:t>.</w:t>
+      </w:r>
+      <w:r>
+        <w:rPr>
+          <w:color w:val="auto"/>
+        </w:rPr>
+        <w:t xml:space="preserve"> </w:t>
+      </w:r>
+    </w:p>
+    <w:p>
+      <w:pPr>
+        <w:rPr>
+          <w:color w:val="auto"/>
+        </w:rPr>
+      </w:pPr>
+      <w:r>
+        <w:rPr>
+          <w:color w:val="auto"/>
+        </w:rPr>
+        <w:t xml:space="preserve">The operation was intended to at least partially capture the German-occupied French city of </w:t>
+      </w:r>
+      <w:hyperlink r:id="rId65" w:history="1">
+        <w:r>
+          <w:rPr>
+            <w:rStyle w:val="Hyperlink"/>
+            <w:color w:val="auto"/>
+            <w:u w:val="none"/>
+          </w:rPr>
+          <w:t>Caen</w:t>
+        </w:r>
+      </w:hyperlink>
+      <w:r>
+        <w:rPr>
+          <w:color w:val="auto"/>
+        </w:rPr>
+        <w:t xml:space="preserve">, which was an important Allied objective during the opening stages of Operation Overlord. It was also hoped that the attack would pre-empt the transfer of German armoured units from the Anglo-Canadian sector to the lightly-screened American </w:t>
+      </w:r>
+      <w:r>
+        <w:rPr>
+          <w:color w:val="auto"/>
+        </w:rPr>
+        <w:lastRenderedPageBreak/>
+        <w:t xml:space="preserve">sector, where a major US offensive was being planned. The British and Canadians advanced on a broad front and by the evening of the second day had taken Caen up to the </w:t>
+      </w:r>
+      <w:hyperlink r:id="rId66" w:tooltip="Orne River" w:history="1">
+        <w:r>
+          <w:rPr>
+            <w:rStyle w:val="Hyperlink"/>
+            <w:color w:val="auto"/>
+            <w:u w:val="none"/>
+          </w:rPr>
+          <w:t>Orne</w:t>
+        </w:r>
+      </w:hyperlink>
+      <w:r>
+        <w:rPr>
+          <w:color w:val="auto"/>
+        </w:rPr>
+        <w:t xml:space="preserve"> and </w:t>
+      </w:r>
+      <w:hyperlink r:id="rId67" w:tooltip="River Odon" w:history="1">
+        <w:r>
+          <w:rPr>
+            <w:rStyle w:val="Hyperlink"/>
+            <w:color w:val="auto"/>
+            <w:u w:val="none"/>
+          </w:rPr>
+          <w:t>Odon</w:t>
+        </w:r>
+      </w:hyperlink>
+      <w:r>
+        <w:rPr>
+          <w:color w:val="auto"/>
+        </w:rPr>
+        <w:t xml:space="preserve"> rivers.</w:t>
+      </w:r>
+    </w:p>
+    <w:p>
+      <w:pPr>
+        <w:rPr>
+          <w:color w:val="auto"/>
+        </w:rPr>
+      </w:pPr>
+      <w:r>
+        <w:rPr>
+          <w:color w:val="auto"/>
+        </w:rPr>
+        <w:t>On the night before the ground assault, nearly 500 </w:t>
+      </w:r>
+      <w:hyperlink r:id="rId68" w:tgtFrame="_blank" w:history="1">
+        <w:r>
+          <w:rPr>
+            <w:rStyle w:val="Hyperlink"/>
+            <w:color w:val="auto"/>
+            <w:u w:val="none"/>
+          </w:rPr>
+          <w:t>RAF Bomber Command</w:t>
+        </w:r>
+      </w:hyperlink>
+      <w:r>
+        <w:rPr>
+          <w:color w:val="auto"/>
+        </w:rPr>
+        <w:t> aircraft dropped over 2,000 tons of bombs on Caen. While it boosted Allied morale, it was controversial as it leveled much of the historic city center and the resulting rubble hindered Allied tank movement.</w:t>
+      </w:r>
+    </w:p>
+    <w:p>
+      <w:pPr>
+        <w:rPr>
+          <w:i/>
+          <w:iCs/>
+          <w:color w:val="auto"/>
+          <w:sz w:val="32"/>
+          <w:szCs w:val="32"/>
+        </w:rPr>
+      </w:pPr>
+      <w:r>
+        <w:rPr>
+          <w:color w:val="auto"/>
+          <w:sz w:val="32"/>
+          <w:szCs w:val="32"/>
+        </w:rPr>
+        <w:t xml:space="preserve">CARD 19 </w:t>
+      </w:r>
+      <w:r>
+        <w:rPr>
+          <w:i/>
+          <w:iCs/>
+          <w:color w:val="auto"/>
+          <w:sz w:val="32"/>
+          <w:szCs w:val="32"/>
+        </w:rPr>
+        <w:t>88mm F</w:t>
+      </w:r>
+      <w:r>
+        <w:rPr>
+          <w:i/>
+          <w:iCs/>
+          <w:color w:val="auto"/>
+          <w:sz w:val="32"/>
+          <w:szCs w:val="32"/>
+        </w:rPr>
+        <w:t>l</w:t>
+      </w:r>
+      <w:r>
+        <w:rPr>
+          <w:i/>
+          <w:iCs/>
+          <w:color w:val="auto"/>
+          <w:sz w:val="32"/>
+          <w:szCs w:val="32"/>
+        </w:rPr>
+        <w:t>ak</w:t>
+      </w:r>
+    </w:p>
+    <w:p>
+      <w:pPr>
+        <w:rPr>
+          <w:color w:val="auto"/>
+        </w:rPr>
+      </w:pPr>
+      <w:r>
+        <w:rPr>
+          <w:color w:val="auto"/>
+        </w:rPr>
+        <w:t xml:space="preserve">The German 88mm Flak (Flugabwehrkanone) was a pivotal, dual-purpose gun in Normandy, 1944, renowned for its lethality as an anti-tank weapon. </w:t>
+      </w:r>
+    </w:p>
+    <w:p>
+      <w:pPr>
+        <w:rPr>
+          <w:color w:val="auto"/>
+        </w:rPr>
+      </w:pPr>
+      <w:r>
+        <w:rPr>
+          <w:color w:val="auto"/>
+        </w:rPr>
+        <w:t>Allied tankers greatly feared the "eighty-eight" for its ability to penetrate armor from long ranges. It was used in both defensive beach positions and to counter Allied armored breakthroughs in the hedgerow country.</w:t>
+      </w:r>
     </w:p>
     <w:p>
       <w:pPr>
@@ -2284,6 +3210,9 @@
         </w:rPr>
       </w:pPr>
       <w:r>
+        <w:t>Deployed in hidden, entrenched, or bunker positions, often covering key road junctions, the bocage (hedgerow) terrain made them hard to locate and destroy.</w:t>
+      </w:r>
+      <w:r>
         <w:br w:type="page"/>
       </w:r>
     </w:p>
@@ -2291,12 +3220,174 @@
       <w:pPr>
         <w:pStyle w:val="Heading1"/>
       </w:pPr>
+      <w:bookmarkStart w:id="9" w:name="_Toc227252124"/>
       <w:r>
         <w:lastRenderedPageBreak/>
         <w:t>Extended Example of Play</w:t>
       </w:r>
+      <w:bookmarkEnd w:id="9"/>
     </w:p>
     <w:p/>
+    <w:p/>
+    <w:p>
+      <w:pPr>
+        <w:pStyle w:val="Heading1"/>
+      </w:pPr>
+      <w:r>
+        <w:t>Designer Notes</w:t>
+      </w:r>
+    </w:p>
+    <w:p/>
+    <w:p>
+      <w:r>
+        <w:t xml:space="preserve">Back in 2011, after having played several of the VPG </w:t>
+      </w:r>
+      <w:r>
+        <w:rPr>
+          <w:i/>
+          <w:iCs/>
+        </w:rPr>
+        <w:t>States of Siege</w:t>
+      </w:r>
+      <w:r>
+        <w:t xml:space="preserve"> games</w:t>
+      </w:r>
+      <w:r>
+        <w:t xml:space="preserve"> -</w:t>
+      </w:r>
+      <w:r>
+        <w:t xml:space="preserve"> </w:t>
+      </w:r>
+      <w:r>
+        <w:rPr>
+          <w:i/>
+          <w:iCs/>
+        </w:rPr>
+        <w:t>Lost Cause and We Must Tell the Emperor</w:t>
+      </w:r>
+      <w:r>
+        <w:t xml:space="preserve"> among them</w:t>
+      </w:r>
+      <w:r>
+        <w:t xml:space="preserve"> -</w:t>
+      </w:r>
+      <w:r>
+        <w:t xml:space="preserve">I noted that the system was predominantly designed for grand sweeps of history, often spanning many years, </w:t>
+      </w:r>
+      <w:r>
+        <w:t xml:space="preserve">or even centuries, </w:t>
+      </w:r>
+      <w:r>
+        <w:t xml:space="preserve">at a high level of abstraction. So </w:t>
+      </w:r>
+      <w:r>
+        <w:t xml:space="preserve">I </w:t>
+      </w:r>
+      <w:r>
+        <w:t xml:space="preserve">got to wondering: “Could this game system be scaled down to the operational level?”. The result </w:t>
+      </w:r>
+      <w:r>
+        <w:t>I believe is yes, hence</w:t>
+      </w:r>
+      <w:r>
+        <w:t xml:space="preserve"> </w:t>
+      </w:r>
+      <w:r>
+        <w:rPr>
+          <w:i/>
+          <w:iCs/>
+        </w:rPr>
+        <w:t>Normandy: The Bloody Pocket</w:t>
+      </w:r>
+      <w:r>
+        <w:t xml:space="preserve">, which I hope will be the first of a number of titles, adapting this great solitaire system to operational level campaigns. </w:t>
+      </w:r>
+    </w:p>
+    <w:p>
+      <w:r>
+        <w:t>The prototype was duly completed, using scissors, a printer and glue, and the rulebook sent over to Alan Emrich and John Welch at VPG. The feedback was very positive, but then I needed to test the game to its limits.</w:t>
+      </w:r>
+    </w:p>
+    <w:p>
+      <w:r>
+        <w:t>Sadly, work and family commitments got in the way, and the demise of VPG meant that the project got left for 15 years, until now.</w:t>
+      </w:r>
+    </w:p>
+    <w:p>
+      <w:r>
+        <w:t xml:space="preserve">Having seen the rejuvination </w:t>
+      </w:r>
+      <w:r>
+        <w:t xml:space="preserve">of interest </w:t>
+      </w:r>
+      <w:r>
+        <w:t xml:space="preserve">in the series, with reprints of </w:t>
+      </w:r>
+      <w:r>
+        <w:rPr>
+          <w:i/>
+          <w:iCs/>
+        </w:rPr>
+        <w:t>Ottoman Sunset</w:t>
+      </w:r>
+      <w:r>
+        <w:t xml:space="preserve"> and</w:t>
+      </w:r>
+      <w:r>
+        <w:rPr>
+          <w:i/>
+          <w:iCs/>
+        </w:rPr>
+        <w:t xml:space="preserve"> Hapsburge Eclipse</w:t>
+      </w:r>
+      <w:r>
+        <w:t>, among others, in addtion to great new games from Ben Madison, and the David Kennedy substack, now that I have a bit more time on my hands I wondered if I couldn’t revisit the game.</w:t>
+      </w:r>
+      <w:r>
+        <w:t xml:space="preserve"> Luckily I found all the old electronic files in my email outbox so I was able to redo all the artwork by using the old material.</w:t>
+      </w:r>
+      <w:r>
+        <w:br/>
+      </w:r>
+      <w:r>
+        <w:br/>
+        <w:t xml:space="preserve">Well, 15 years on and AI is there to help with creating the graphics for a prototype, which I put into </w:t>
+      </w:r>
+      <w:r>
+        <w:rPr>
+          <w:i/>
+          <w:iCs/>
+        </w:rPr>
+        <w:t>TableTop Simulator</w:t>
+      </w:r>
+      <w:r>
+        <w:t>, and, voila, we have a game</w:t>
+      </w:r>
+      <w:r>
+        <w:t>!</w:t>
+      </w:r>
+    </w:p>
+    <w:p>
+      <w:r>
+        <w:t>What were the design considerations?</w:t>
+      </w:r>
+    </w:p>
+    <w:p>
+      <w:r>
+        <w:t>First and foremost, I wanted the game to model two things that aren’t always evident in WW2 simulations: i) Hitler’s interference in operational matters, and the correct employment of reserves.</w:t>
+      </w:r>
+    </w:p>
+    <w:p>
+      <w:r>
+        <w:t>Second, it needed to play fast, around 2 hours. Like many, I don’t seem to have the attention span to play solitairee games for hours on end. I wanted it to be quick and also give the player as many decisions each turn as possible.</w:t>
+      </w:r>
+    </w:p>
+    <w:p>
+      <w:r>
+        <w:t>Thirdly, it needed to model the situation correctly from the German perpective; you can hold the Allies very effectively for the first half of the campaign, but your position will quickly deterioate. As was the case historically.</w:t>
+      </w:r>
+    </w:p>
+    <w:p/>
     <w:p>
       <w:r>
         <w:br w:type="page"/>
@@ -2306,13 +3397,15 @@
       <w:pPr>
         <w:pStyle w:val="Heading1"/>
       </w:pPr>
+      <w:bookmarkStart w:id="10" w:name="_Toc227252125"/>
       <w:r>
         <w:lastRenderedPageBreak/>
         <w:t>Designer Notes</w:t>
       </w:r>
+      <w:bookmarkEnd w:id="10"/>
     </w:p>
     <w:sectPr>
-      <w:footerReference w:type="default" r:id="rId60"/>
+      <w:footerReference w:type="default" r:id="rId69"/>
       <w:pgSz w:w="11906" w:h="16838"/>
       <w:pgMar w:top="720" w:right="720" w:bottom="720" w:left="720" w:header="708" w:footer="708" w:gutter="0"/>
       <w:cols w:space="708"/>
@@ -4665,7 +5758,6 @@
   <w:style w:type="character" w:default="1" w:styleId="DefaultParagraphFont">
     <w:name w:val="Default Paragraph Font"/>
     <w:uiPriority w:val="1"/>
-    <w:semiHidden/>
     <w:unhideWhenUsed/>
   </w:style>
   <w:style w:type="table" w:default="1" w:styleId="TableNormal">
@@ -4982,6 +6074,18 @@
       </w:tblBorders>
     </w:tblPr>
   </w:style>
+  <w:style w:type="character" w:styleId="UnresolvedMention">
+    <w:name w:val="Unresolved Mention"/>
+    <w:basedOn w:val="DefaultParagraphFont"/>
+    <w:uiPriority w:val="99"/>
+    <w:semiHidden/>
+    <w:unhideWhenUsed/>
+    <w:rsid w:val="00E025AA"/>
+    <w:rPr>
+      <w:color w:val="605E5C"/>
+      <w:shd w:val="clear" w:color="auto" w:fill="E1DFDD"/>
+    </w:rPr>
+  </w:style>
 </w:styles>
 </file>
 

</xml_diff>